<commit_message>
changed doc. to prof.
</commit_message>
<xml_diff>
--- a/SEO Automation.docx
+++ b/SEO Automation.docx
@@ -600,7 +600,21 @@
           <w:rStyle w:val="normaltextrun"/>
           <w:rFonts w:eastAsiaTheme="majorEastAsia"/>
         </w:rPr>
-        <w:t>Student:Božidar Mitić, br. indeksa: 18</w:t>
+        <w:t>Student:</w:t>
+      </w:r>
+      <w:r>
+        <w:rPr>
+          <w:rStyle w:val="normaltextrun"/>
+          <w:rFonts w:eastAsiaTheme="majorEastAsia"/>
+        </w:rPr>
+        <w:t xml:space="preserve"> </w:t>
+      </w:r>
+      <w:r>
+        <w:rPr>
+          <w:rStyle w:val="normaltextrun"/>
+          <w:rFonts w:eastAsiaTheme="majorEastAsia"/>
+        </w:rPr>
+        <w:t>Božidar Mitić, br. indeksa: 18</w:t>
       </w:r>
       <w:r>
         <w:rPr>
@@ -639,7 +653,14 @@
           <w:rStyle w:val="normaltextrun"/>
           <w:rFonts w:eastAsiaTheme="majorEastAsia"/>
         </w:rPr>
-        <w:t xml:space="preserve">doc. dr </w:t>
+        <w:t xml:space="preserve"> prof</w:t>
+      </w:r>
+      <w:r>
+        <w:rPr>
+          <w:rStyle w:val="normaltextrun"/>
+          <w:rFonts w:eastAsiaTheme="majorEastAsia"/>
+        </w:rPr>
+        <w:t xml:space="preserve">. dr </w:t>
       </w:r>
       <w:r>
         <w:rPr>
@@ -11192,13 +11213,7 @@
     </w:p>
     <w:p>
       <w:r>
-        <w:t>[</w:t>
-      </w:r>
-      <w:r>
-        <w:t>3</w:t>
-      </w:r>
-      <w:r>
-        <w:t xml:space="preserve">] </w:t>
+        <w:t xml:space="preserve">[3] </w:t>
       </w:r>
       <w:r>
         <w:t>–</w:t>
@@ -11220,13 +11235,7 @@
     </w:p>
     <w:p>
       <w:r>
-        <w:t>[</w:t>
-      </w:r>
-      <w:r>
-        <w:t>4</w:t>
-      </w:r>
-      <w:r>
-        <w:t xml:space="preserve">] </w:t>
+        <w:t xml:space="preserve">[4] </w:t>
       </w:r>
       <w:r>
         <w:t>–</w:t>
@@ -11248,13 +11257,7 @@
     </w:p>
     <w:p>
       <w:r>
-        <w:t>[</w:t>
-      </w:r>
-      <w:r>
-        <w:t>5</w:t>
-      </w:r>
-      <w:r>
-        <w:t xml:space="preserve">] </w:t>
+        <w:t xml:space="preserve">[5] </w:t>
       </w:r>
       <w:r>
         <w:t>–</w:t>
@@ -16907,6 +16910,7 @@
   <w:style w:type="character" w:default="1" w:styleId="DefaultParagraphFont">
     <w:name w:val="Default Paragraph Font"/>
     <w:uiPriority w:val="1"/>
+    <w:semiHidden/>
     <w:unhideWhenUsed/>
   </w:style>
   <w:style w:type="table" w:default="1" w:styleId="TableNormal">

</xml_diff>